<commit_message>
Bring the template and specimen to house style v2.0
house-style-template.docx and house-style-specimen.html now carry the
v2.0 tokens: Montserrat for chrome and headings, Roboto Serif for body,
brand black ink, ink-soft #55575B, rule #E4E4E6, brand red #D50032 for
the record rule, section numbers, table header rule, defined-term
underline, and note border, and #FCE6EA for the note wash. The Word
heading and hyperlink styles use the same tokens. Sample text is in
sentence case.
</commit_message>
<xml_diff>
--- a/conventions/templates/house-style-template.docx
+++ b/conventions/templates/house-style-template.docx
@@ -8,12 +8,12 @@
       </w:pPr>
       <w:r>
         <w:rPr>
-          <w:rFonts w:ascii="Courier Prime" w:cs="Courier Prime" w:eastAsia="Courier Prime" w:hAnsi="Courier Prime"/>
-          <w:color w:val="6E1F2A"/>
+          <w:rFonts w:ascii="Montserrat" w:cs="Montserrat" w:eastAsia="Montserrat" w:hAnsi="Montserrat"/>
+          <w:color w:val="D50032"/>
           <w:sz w:val="18"/>
           <w:szCs w:val="18"/>
         </w:rPr>
-        <w:t xml:space="preserve">house-style specimen</w:t>
+        <w:t xml:space="preserve">House style specimen</w:t>
       </w:r>
     </w:p>
     <w:tbl>
@@ -55,23 +55,23 @@
             </w:pPr>
             <w:r>
               <w:rPr>
-                <w:rFonts w:ascii="Courier Prime" w:cs="Courier Prime" w:eastAsia="Courier Prime" w:hAnsi="Courier Prime"/>
-                <w:color w:val="5E6166"/>
+                <w:rFonts w:ascii="Montserrat" w:cs="Montserrat" w:eastAsia="Montserrat" w:hAnsi="Montserrat"/>
+                <w:color w:val="55575B"/>
                 <w:sz w:val="17"/>
                 <w:szCs w:val="17"/>
               </w:rPr>
-              <w:t xml:space="preserve">committee</w:t>
-            </w:r>
-          </w:p>
-          <w:p>
-            <w:r>
-              <w:rPr>
-                <w:rFonts w:ascii="Courier Prime" w:cs="Courier Prime" w:eastAsia="Courier Prime" w:hAnsi="Courier Prime"/>
-                <w:color w:val="1B1C1E"/>
+              <w:t xml:space="preserve">Committee</w:t>
+            </w:r>
+          </w:p>
+          <w:p>
+            <w:r>
+              <w:rPr>
+                <w:rFonts w:ascii="Montserrat" w:cs="Montserrat" w:eastAsia="Montserrat" w:hAnsi="Montserrat"/>
+                <w:color w:val="000000"/>
                 <w:sz w:val="20"/>
                 <w:szCs w:val="20"/>
               </w:rPr>
-              <w:t xml:space="preserve">class curriculum committee</w:t>
+              <w:t xml:space="preserve">CLASS Curriculum Committee</w:t>
             </w:r>
           </w:p>
         </w:tc>
@@ -97,23 +97,23 @@
             </w:pPr>
             <w:r>
               <w:rPr>
-                <w:rFonts w:ascii="Courier Prime" w:cs="Courier Prime" w:eastAsia="Courier Prime" w:hAnsi="Courier Prime"/>
-                <w:color w:val="5E6166"/>
+                <w:rFonts w:ascii="Montserrat" w:cs="Montserrat" w:eastAsia="Montserrat" w:hAnsi="Montserrat"/>
+                <w:color w:val="55575B"/>
                 <w:sz w:val="17"/>
                 <w:szCs w:val="17"/>
               </w:rPr>
-              <w:t xml:space="preserve">document</w:t>
-            </w:r>
-          </w:p>
-          <w:p>
-            <w:r>
-              <w:rPr>
-                <w:rFonts w:ascii="Courier Prime" w:cs="Courier Prime" w:eastAsia="Courier Prime" w:hAnsi="Courier Prime"/>
-                <w:color w:val="1B1C1E"/>
+              <w:t xml:space="preserve">Document</w:t>
+            </w:r>
+          </w:p>
+          <w:p>
+            <w:r>
+              <w:rPr>
+                <w:rFonts w:ascii="Montserrat" w:cs="Montserrat" w:eastAsia="Montserrat" w:hAnsi="Montserrat"/>
+                <w:color w:val="000000"/>
                 <w:sz w:val="20"/>
                 <w:szCs w:val="20"/>
               </w:rPr>
-              <w:t xml:space="preserve">program modification</w:t>
+              <w:t xml:space="preserve">Program modification</w:t>
             </w:r>
           </w:p>
         </w:tc>
@@ -141,23 +141,23 @@
             </w:pPr>
             <w:r>
               <w:rPr>
-                <w:rFonts w:ascii="Courier Prime" w:cs="Courier Prime" w:eastAsia="Courier Prime" w:hAnsi="Courier Prime"/>
-                <w:color w:val="5E6166"/>
+                <w:rFonts w:ascii="Montserrat" w:cs="Montserrat" w:eastAsia="Montserrat" w:hAnsi="Montserrat"/>
+                <w:color w:val="55575B"/>
                 <w:sz w:val="17"/>
                 <w:szCs w:val="17"/>
               </w:rPr>
-              <w:t xml:space="preserve">effective</w:t>
-            </w:r>
-          </w:p>
-          <w:p>
-            <w:r>
-              <w:rPr>
-                <w:rFonts w:ascii="Courier Prime" w:cs="Courier Prime" w:eastAsia="Courier Prime" w:hAnsi="Courier Prime"/>
-                <w:color w:val="1B1C1E"/>
+              <w:t xml:space="preserve">Effective</w:t>
+            </w:r>
+          </w:p>
+          <w:p>
+            <w:r>
+              <w:rPr>
+                <w:rFonts w:ascii="Montserrat" w:cs="Montserrat" w:eastAsia="Montserrat" w:hAnsi="Montserrat"/>
+                <w:color w:val="000000"/>
                 <w:sz w:val="20"/>
                 <w:szCs w:val="20"/>
               </w:rPr>
-              <w:t xml:space="preserve">fall 2027</w:t>
+              <w:t xml:space="preserve">Fall 2027</w:t>
             </w:r>
           </w:p>
         </w:tc>
@@ -183,23 +183,23 @@
             </w:pPr>
             <w:r>
               <w:rPr>
-                <w:rFonts w:ascii="Courier Prime" w:cs="Courier Prime" w:eastAsia="Courier Prime" w:hAnsi="Courier Prime"/>
-                <w:color w:val="5E6166"/>
+                <w:rFonts w:ascii="Montserrat" w:cs="Montserrat" w:eastAsia="Montserrat" w:hAnsi="Montserrat"/>
+                <w:color w:val="55575B"/>
                 <w:sz w:val="17"/>
                 <w:szCs w:val="17"/>
               </w:rPr>
-              <w:t xml:space="preserve">status</w:t>
-            </w:r>
-          </w:p>
-          <w:p>
-            <w:r>
-              <w:rPr>
-                <w:rFonts w:ascii="Courier Prime" w:cs="Courier Prime" w:eastAsia="Courier Prime" w:hAnsi="Courier Prime"/>
-                <w:color w:val="1B1C1E"/>
+              <w:t xml:space="preserve">Status</w:t>
+            </w:r>
+          </w:p>
+          <w:p>
+            <w:r>
+              <w:rPr>
+                <w:rFonts w:ascii="Montserrat" w:cs="Montserrat" w:eastAsia="Montserrat" w:hAnsi="Montserrat"/>
+                <w:color w:val="000000"/>
                 <w:sz w:val="20"/>
                 <w:szCs w:val="20"/>
               </w:rPr>
-              <w:t xml:space="preserve">draft for review</w:t>
+              <w:t xml:space="preserve">Draft for review</w:t>
             </w:r>
           </w:p>
         </w:tc>
@@ -208,7 +208,7 @@
     <w:p>
       <w:pPr>
         <w:pBdr>
-          <w:bottom w:val="single" w:color="6E1F2A" w:sz="12" w:space="4"/>
+          <w:bottom w:val="single" w:color="D50032" w:sz="12" w:space="4"/>
         </w:pBdr>
         <w:spacing w:after="280" w:before="120"/>
       </w:pPr>
@@ -219,14 +219,14 @@
       </w:pPr>
       <w:r>
         <w:rPr>
-          <w:rFonts w:ascii="Courier Prime" w:cs="Courier Prime" w:eastAsia="Courier Prime" w:hAnsi="Courier Prime"/>
+          <w:rFonts w:ascii="Montserrat" w:cs="Montserrat" w:eastAsia="Montserrat" w:hAnsi="Montserrat"/>
           <w:b/>
           <w:bCs/>
-          <w:color w:val="1B1C1E"/>
+          <w:color w:val="000000"/>
           <w:sz w:val="40"/>
           <w:szCs w:val="40"/>
         </w:rPr>
-        <w:t xml:space="preserve">program modification: graduate sequence in music</w:t>
+        <w:t xml:space="preserve">Program modification: graduate sequence in music</w:t>
       </w:r>
     </w:p>
     <w:p>
@@ -235,21 +235,21 @@
       </w:pPr>
       <w:r>
         <w:rPr>
-          <w:rFonts w:ascii="Courier Prime" w:cs="Courier Prime" w:eastAsia="Courier Prime" w:hAnsi="Courier Prime"/>
-          <w:color w:val="5E6166"/>
+          <w:rFonts w:ascii="Montserrat" w:cs="Montserrat" w:eastAsia="Montserrat" w:hAnsi="Montserrat"/>
+          <w:color w:val="55575B"/>
           <w:sz w:val="20"/>
           <w:szCs w:val="20"/>
         </w:rPr>
-        <w:t xml:space="preserve">prepared by i. thiebaut · spring 2026 · routing id </w:t>
-      </w:r>
-      <w:r>
-        <w:rPr>
-          <w:rFonts w:ascii="Courier Prime" w:cs="Courier Prime" w:eastAsia="Courier Prime" w:hAnsi="Courier Prime"/>
-          <w:color w:val="1B1C1E"/>
+        <w:t xml:space="preserve">Prepared by I. Thiebaut · Spring 2026 · routing ID </w:t>
+      </w:r>
+      <w:r>
+        <w:rPr>
+          <w:rFonts w:ascii="Montserrat" w:cs="Montserrat" w:eastAsia="Montserrat" w:hAnsi="Montserrat"/>
+          <w:color w:val="000000"/>
           <w:sz w:val="20"/>
           <w:szCs w:val="20"/>
         </w:rPr>
-        <w:t xml:space="preserve">cm-2026-014</w:t>
+        <w:t xml:space="preserve">CM-2026-014</w:t>
       </w:r>
     </w:p>
     <w:p>
@@ -258,10 +258,10 @@
       </w:pPr>
       <w:r>
         <w:rPr>
-          <w:rFonts w:ascii="Courier Prime" w:cs="Courier Prime" w:eastAsia="Courier Prime" w:hAnsi="Courier Prime"/>
+          <w:rFonts w:ascii="Montserrat" w:cs="Montserrat" w:eastAsia="Montserrat" w:hAnsi="Montserrat"/>
           <w:b/>
           <w:bCs/>
-          <w:color w:val="6E1F2A"/>
+          <w:color w:val="D50032"/>
           <w:sz w:val="26"/>
           <w:szCs w:val="26"/>
         </w:rPr>
@@ -269,14 +269,14 @@
       </w:r>
       <w:r>
         <w:rPr>
-          <w:rFonts w:ascii="Courier Prime" w:cs="Courier Prime" w:eastAsia="Courier Prime" w:hAnsi="Courier Prime"/>
+          <w:rFonts w:ascii="Montserrat" w:cs="Montserrat" w:eastAsia="Montserrat" w:hAnsi="Montserrat"/>
           <w:b/>
           <w:bCs/>
-          <w:color w:val="1B1C1E"/>
+          <w:color w:val="000000"/>
           <w:sz w:val="26"/>
           <w:szCs w:val="26"/>
         </w:rPr>
-        <w:t xml:space="preserve">rationale</w:t>
+        <w:t xml:space="preserve">Rationale</w:t>
       </w:r>
     </w:p>
     <w:p>
@@ -285,8 +285,8 @@
       </w:pPr>
       <w:r>
         <w:rPr>
-          <w:rFonts w:ascii="Source Serif 4" w:cs="Source Serif 4" w:eastAsia="Source Serif 4" w:hAnsi="Source Serif 4"/>
-          <w:color w:val="1B1C1E"/>
+          <w:rFonts w:ascii="Roboto Serif" w:cs="Roboto Serif" w:eastAsia="Roboto Serif" w:hAnsi="Roboto Serif"/>
+          <w:color w:val="000000"/>
           <w:sz w:val="22"/>
           <w:szCs w:val="22"/>
         </w:rPr>
@@ -299,8 +299,8 @@
       </w:pPr>
       <w:r>
         <w:rPr>
-          <w:rFonts w:ascii="Source Serif 4" w:cs="Source Serif 4" w:eastAsia="Source Serif 4" w:hAnsi="Source Serif 4"/>
-          <w:color w:val="1B1C1E"/>
+          <w:rFonts w:ascii="Roboto Serif" w:cs="Roboto Serif" w:eastAsia="Roboto Serif" w:hAnsi="Roboto Serif"/>
+          <w:color w:val="000000"/>
           <w:sz w:val="22"/>
           <w:szCs w:val="22"/>
         </w:rPr>
@@ -308,18 +308,18 @@
       </w:r>
       <w:r>
         <w:rPr>
-          <w:rFonts w:ascii="Source Serif 4" w:cs="Source Serif 4" w:eastAsia="Source Serif 4" w:hAnsi="Source Serif 4"/>
-          <w:color w:val="1B1C1E"/>
+          <w:rFonts w:ascii="Roboto Serif" w:cs="Roboto Serif" w:eastAsia="Roboto Serif" w:hAnsi="Roboto Serif"/>
+          <w:color w:val="000000"/>
           <w:sz w:val="22"/>
           <w:szCs w:val="22"/>
-          <w:u w:val="single" w:color="6E1F2A"/>
+          <w:u w:val="single" w:color="D50032"/>
         </w:rPr>
         <w:t xml:space="preserve">dual-listed</w:t>
       </w:r>
       <w:r>
         <w:rPr>
-          <w:rFonts w:ascii="Courier Prime" w:cs="Courier Prime" w:eastAsia="Courier Prime" w:hAnsi="Courier Prime"/>
-          <w:color w:val="5E6166"/>
+          <w:rFonts w:ascii="Montserrat" w:cs="Montserrat" w:eastAsia="Montserrat" w:hAnsi="Montserrat"/>
+          <w:color w:val="55575B"/>
           <w:sz w:val="19"/>
           <w:szCs w:val="19"/>
         </w:rPr>
@@ -327,8 +327,8 @@
       </w:r>
       <w:r>
         <w:rPr>
-          <w:rFonts w:ascii="Source Serif 4" w:cs="Source Serif 4" w:eastAsia="Source Serif 4" w:hAnsi="Source Serif 4"/>
-          <w:color w:val="1B1C1E"/>
+          <w:rFonts w:ascii="Roboto Serif" w:cs="Roboto Serif" w:eastAsia="Roboto Serif" w:hAnsi="Roboto Serif"/>
+          <w:color w:val="000000"/>
           <w:sz w:val="22"/>
           <w:szCs w:val="22"/>
         </w:rPr>
@@ -341,10 +341,10 @@
       </w:pPr>
       <w:r>
         <w:rPr>
-          <w:rFonts w:ascii="Courier Prime" w:cs="Courier Prime" w:eastAsia="Courier Prime" w:hAnsi="Courier Prime"/>
+          <w:rFonts w:ascii="Montserrat" w:cs="Montserrat" w:eastAsia="Montserrat" w:hAnsi="Montserrat"/>
           <w:b/>
           <w:bCs/>
-          <w:color w:val="6E1F2A"/>
+          <w:color w:val="D50032"/>
           <w:sz w:val="26"/>
           <w:szCs w:val="26"/>
         </w:rPr>
@@ -352,14 +352,14 @@
       </w:r>
       <w:r>
         <w:rPr>
-          <w:rFonts w:ascii="Courier Prime" w:cs="Courier Prime" w:eastAsia="Courier Prime" w:hAnsi="Courier Prime"/>
+          <w:rFonts w:ascii="Montserrat" w:cs="Montserrat" w:eastAsia="Montserrat" w:hAnsi="Montserrat"/>
           <w:b/>
           <w:bCs/>
-          <w:color w:val="1B1C1E"/>
+          <w:color w:val="000000"/>
           <w:sz w:val="26"/>
           <w:szCs w:val="26"/>
         </w:rPr>
-        <w:t xml:space="preserve">proposed changes</w:t>
+        <w:t xml:space="preserve">Proposed changes</w:t>
       </w:r>
     </w:p>
     <w:tbl>
@@ -386,7 +386,7 @@
             <w:tcBorders>
               <w:top w:val="none" w:color="FFFFFF" w:sz="0"/>
               <w:left w:val="none" w:color="FFFFFF" w:sz="0"/>
-              <w:bottom w:val="single" w:color="6E1F2A" w:sz="12"/>
+              <w:bottom w:val="single" w:color="D50032" w:sz="12"/>
               <w:right w:val="none" w:color="FFFFFF" w:sz="0"/>
             </w:tcBorders>
             <w:tcMar>
@@ -402,12 +402,12 @@
             </w:pPr>
             <w:r>
               <w:rPr>
-                <w:rFonts w:ascii="Courier Prime" w:cs="Courier Prime" w:eastAsia="Courier Prime" w:hAnsi="Courier Prime"/>
-                <w:color w:val="5E6166"/>
+                <w:rFonts w:ascii="Montserrat" w:cs="Montserrat" w:eastAsia="Montserrat" w:hAnsi="Montserrat"/>
+                <w:color w:val="55575B"/>
                 <w:sz w:val="18"/>
                 <w:szCs w:val="18"/>
               </w:rPr>
-              <w:t xml:space="preserve">course</w:t>
+              <w:t xml:space="preserve">Course</w:t>
             </w:r>
           </w:p>
         </w:tc>
@@ -417,7 +417,7 @@
             <w:tcBorders>
               <w:top w:val="none" w:color="FFFFFF" w:sz="0"/>
               <w:left w:val="none" w:color="FFFFFF" w:sz="0"/>
-              <w:bottom w:val="single" w:color="6E1F2A" w:sz="12"/>
+              <w:bottom w:val="single" w:color="D50032" w:sz="12"/>
               <w:right w:val="none" w:color="FFFFFF" w:sz="0"/>
             </w:tcBorders>
             <w:tcMar>
@@ -433,12 +433,12 @@
             </w:pPr>
             <w:r>
               <w:rPr>
-                <w:rFonts w:ascii="Courier Prime" w:cs="Courier Prime" w:eastAsia="Courier Prime" w:hAnsi="Courier Prime"/>
-                <w:color w:val="5E6166"/>
+                <w:rFonts w:ascii="Montserrat" w:cs="Montserrat" w:eastAsia="Montserrat" w:hAnsi="Montserrat"/>
+                <w:color w:val="55575B"/>
                 <w:sz w:val="18"/>
                 <w:szCs w:val="18"/>
               </w:rPr>
-              <w:t xml:space="preserve">action</w:t>
+              <w:t xml:space="preserve">Action</w:t>
             </w:r>
           </w:p>
         </w:tc>
@@ -448,7 +448,7 @@
             <w:tcBorders>
               <w:top w:val="none" w:color="FFFFFF" w:sz="0"/>
               <w:left w:val="none" w:color="FFFFFF" w:sz="0"/>
-              <w:bottom w:val="single" w:color="6E1F2A" w:sz="12"/>
+              <w:bottom w:val="single" w:color="D50032" w:sz="12"/>
               <w:right w:val="none" w:color="FFFFFF" w:sz="0"/>
             </w:tcBorders>
             <w:tcMar>
@@ -464,12 +464,12 @@
             </w:pPr>
             <w:r>
               <w:rPr>
-                <w:rFonts w:ascii="Courier Prime" w:cs="Courier Prime" w:eastAsia="Courier Prime" w:hAnsi="Courier Prime"/>
-                <w:color w:val="5E6166"/>
+                <w:rFonts w:ascii="Montserrat" w:cs="Montserrat" w:eastAsia="Montserrat" w:hAnsi="Montserrat"/>
+                <w:color w:val="55575B"/>
                 <w:sz w:val="18"/>
                 <w:szCs w:val="18"/>
               </w:rPr>
-              <w:t xml:space="preserve">units</w:t>
+              <w:t xml:space="preserve">Units</w:t>
             </w:r>
           </w:p>
         </w:tc>
@@ -481,7 +481,7 @@
             <w:tcBorders>
               <w:top w:val="none" w:color="FFFFFF" w:sz="0"/>
               <w:left w:val="none" w:color="FFFFFF" w:sz="0"/>
-              <w:bottom w:val="single" w:color="E6E6E3" w:sz="4"/>
+              <w:bottom w:val="single" w:color="E4E4E6" w:sz="4"/>
               <w:right w:val="none" w:color="FFFFFF" w:sz="0"/>
             </w:tcBorders>
             <w:tcMar>
@@ -497,8 +497,8 @@
             </w:pPr>
             <w:r>
               <w:rPr>
-                <w:rFonts w:ascii="Courier Prime" w:cs="Courier Prime" w:eastAsia="Courier Prime" w:hAnsi="Courier Prime"/>
-                <w:color w:val="1B1C1E"/>
+                <w:rFonts w:ascii="Montserrat" w:cs="Montserrat" w:eastAsia="Montserrat" w:hAnsi="Montserrat"/>
+                <w:color w:val="000000"/>
                 <w:sz w:val="20"/>
                 <w:szCs w:val="20"/>
               </w:rPr>
@@ -512,7 +512,7 @@
             <w:tcBorders>
               <w:top w:val="none" w:color="FFFFFF" w:sz="0"/>
               <w:left w:val="none" w:color="FFFFFF" w:sz="0"/>
-              <w:bottom w:val="single" w:color="E6E6E3" w:sz="4"/>
+              <w:bottom w:val="single" w:color="E4E4E6" w:sz="4"/>
               <w:right w:val="none" w:color="FFFFFF" w:sz="0"/>
             </w:tcBorders>
             <w:tcMar>
@@ -528,12 +528,12 @@
             </w:pPr>
             <w:r>
               <w:rPr>
-                <w:rFonts w:ascii="Source Serif 4" w:cs="Source Serif 4" w:eastAsia="Source Serif 4" w:hAnsi="Source Serif 4"/>
-                <w:color w:val="1B1C1E"/>
+                <w:rFonts w:ascii="Roboto Serif" w:cs="Roboto Serif" w:eastAsia="Roboto Serif" w:hAnsi="Roboto Serif"/>
+                <w:color w:val="000000"/>
                 <w:sz w:val="22"/>
                 <w:szCs w:val="22"/>
               </w:rPr>
-              <w:t xml:space="preserve">revise prerequisites</w:t>
+              <w:t xml:space="preserve">Revise prerequisites</w:t>
             </w:r>
           </w:p>
         </w:tc>
@@ -543,7 +543,7 @@
             <w:tcBorders>
               <w:top w:val="none" w:color="FFFFFF" w:sz="0"/>
               <w:left w:val="none" w:color="FFFFFF" w:sz="0"/>
-              <w:bottom w:val="single" w:color="E6E6E3" w:sz="4"/>
+              <w:bottom w:val="single" w:color="E4E4E6" w:sz="4"/>
               <w:right w:val="none" w:color="FFFFFF" w:sz="0"/>
             </w:tcBorders>
             <w:tcMar>
@@ -559,8 +559,8 @@
             </w:pPr>
             <w:r>
               <w:rPr>
-                <w:rFonts w:ascii="Courier Prime" w:cs="Courier Prime" w:eastAsia="Courier Prime" w:hAnsi="Courier Prime"/>
-                <w:color w:val="1B1C1E"/>
+                <w:rFonts w:ascii="Montserrat" w:cs="Montserrat" w:eastAsia="Montserrat" w:hAnsi="Montserrat"/>
+                <w:color w:val="000000"/>
                 <w:sz w:val="20"/>
                 <w:szCs w:val="20"/>
               </w:rPr>
@@ -576,7 +576,7 @@
             <w:tcBorders>
               <w:top w:val="none" w:color="FFFFFF" w:sz="0"/>
               <w:left w:val="none" w:color="FFFFFF" w:sz="0"/>
-              <w:bottom w:val="single" w:color="E6E6E3" w:sz="4"/>
+              <w:bottom w:val="single" w:color="E4E4E6" w:sz="4"/>
               <w:right w:val="none" w:color="FFFFFF" w:sz="0"/>
             </w:tcBorders>
             <w:tcMar>
@@ -592,8 +592,8 @@
             </w:pPr>
             <w:r>
               <w:rPr>
-                <w:rFonts w:ascii="Courier Prime" w:cs="Courier Prime" w:eastAsia="Courier Prime" w:hAnsi="Courier Prime"/>
-                <w:color w:val="1B1C1E"/>
+                <w:rFonts w:ascii="Montserrat" w:cs="Montserrat" w:eastAsia="Montserrat" w:hAnsi="Montserrat"/>
+                <w:color w:val="000000"/>
                 <w:sz w:val="20"/>
                 <w:szCs w:val="20"/>
               </w:rPr>
@@ -607,7 +607,7 @@
             <w:tcBorders>
               <w:top w:val="none" w:color="FFFFFF" w:sz="0"/>
               <w:left w:val="none" w:color="FFFFFF" w:sz="0"/>
-              <w:bottom w:val="single" w:color="E6E6E3" w:sz="4"/>
+              <w:bottom w:val="single" w:color="E4E4E6" w:sz="4"/>
               <w:right w:val="none" w:color="FFFFFF" w:sz="0"/>
             </w:tcBorders>
             <w:tcMar>
@@ -623,12 +623,12 @@
             </w:pPr>
             <w:r>
               <w:rPr>
-                <w:rFonts w:ascii="Source Serif 4" w:cs="Source Serif 4" w:eastAsia="Source Serif 4" w:hAnsi="Source Serif 4"/>
-                <w:color w:val="1B1C1E"/>
+                <w:rFonts w:ascii="Roboto Serif" w:cs="Roboto Serif" w:eastAsia="Roboto Serif" w:hAnsi="Roboto Serif"/>
+                <w:color w:val="000000"/>
                 <w:sz w:val="22"/>
                 <w:szCs w:val="22"/>
               </w:rPr>
-              <w:t xml:space="preserve">increase units</w:t>
+              <w:t xml:space="preserve">Increase units</w:t>
             </w:r>
           </w:p>
         </w:tc>
@@ -638,7 +638,7 @@
             <w:tcBorders>
               <w:top w:val="none" w:color="FFFFFF" w:sz="0"/>
               <w:left w:val="none" w:color="FFFFFF" w:sz="0"/>
-              <w:bottom w:val="single" w:color="E6E6E3" w:sz="4"/>
+              <w:bottom w:val="single" w:color="E4E4E6" w:sz="4"/>
               <w:right w:val="none" w:color="FFFFFF" w:sz="0"/>
             </w:tcBorders>
             <w:tcMar>
@@ -654,8 +654,8 @@
             </w:pPr>
             <w:r>
               <w:rPr>
-                <w:rFonts w:ascii="Courier Prime" w:cs="Courier Prime" w:eastAsia="Courier Prime" w:hAnsi="Courier Prime"/>
-                <w:color w:val="1B1C1E"/>
+                <w:rFonts w:ascii="Montserrat" w:cs="Montserrat" w:eastAsia="Montserrat" w:hAnsi="Montserrat"/>
+                <w:color w:val="000000"/>
                 <w:sz w:val="20"/>
                 <w:szCs w:val="20"/>
               </w:rPr>
@@ -671,7 +671,7 @@
             <w:tcBorders>
               <w:top w:val="none" w:color="FFFFFF" w:sz="0"/>
               <w:left w:val="none" w:color="FFFFFF" w:sz="0"/>
-              <w:bottom w:val="single" w:color="E6E6E3" w:sz="4"/>
+              <w:bottom w:val="single" w:color="E4E4E6" w:sz="4"/>
               <w:right w:val="none" w:color="FFFFFF" w:sz="0"/>
             </w:tcBorders>
             <w:tcMar>
@@ -687,8 +687,8 @@
             </w:pPr>
             <w:r>
               <w:rPr>
-                <w:rFonts w:ascii="Courier Prime" w:cs="Courier Prime" w:eastAsia="Courier Prime" w:hAnsi="Courier Prime"/>
-                <w:color w:val="1B1C1E"/>
+                <w:rFonts w:ascii="Montserrat" w:cs="Montserrat" w:eastAsia="Montserrat" w:hAnsi="Montserrat"/>
+                <w:color w:val="000000"/>
                 <w:sz w:val="20"/>
                 <w:szCs w:val="20"/>
               </w:rPr>
@@ -702,7 +702,7 @@
             <w:tcBorders>
               <w:top w:val="none" w:color="FFFFFF" w:sz="0"/>
               <w:left w:val="none" w:color="FFFFFF" w:sz="0"/>
-              <w:bottom w:val="single" w:color="E6E6E3" w:sz="4"/>
+              <w:bottom w:val="single" w:color="E4E4E6" w:sz="4"/>
               <w:right w:val="none" w:color="FFFFFF" w:sz="0"/>
             </w:tcBorders>
             <w:tcMar>
@@ -718,12 +718,12 @@
             </w:pPr>
             <w:r>
               <w:rPr>
-                <w:rFonts w:ascii="Source Serif 4" w:cs="Source Serif 4" w:eastAsia="Source Serif 4" w:hAnsi="Source Serif 4"/>
-                <w:color w:val="1B1C1E"/>
+                <w:rFonts w:ascii="Roboto Serif" w:cs="Roboto Serif" w:eastAsia="Roboto Serif" w:hAnsi="Roboto Serif"/>
+                <w:color w:val="000000"/>
                 <w:sz w:val="22"/>
                 <w:szCs w:val="22"/>
               </w:rPr>
-              <w:t xml:space="preserve">retitle and recatalog</w:t>
+              <w:t xml:space="preserve">Retitle and recatalog</w:t>
             </w:r>
           </w:p>
         </w:tc>
@@ -733,7 +733,7 @@
             <w:tcBorders>
               <w:top w:val="none" w:color="FFFFFF" w:sz="0"/>
               <w:left w:val="none" w:color="FFFFFF" w:sz="0"/>
-              <w:bottom w:val="single" w:color="E6E6E3" w:sz="4"/>
+              <w:bottom w:val="single" w:color="E4E4E6" w:sz="4"/>
               <w:right w:val="none" w:color="FFFFFF" w:sz="0"/>
             </w:tcBorders>
             <w:tcMar>
@@ -749,8 +749,8 @@
             </w:pPr>
             <w:r>
               <w:rPr>
-                <w:rFonts w:ascii="Courier Prime" w:cs="Courier Prime" w:eastAsia="Courier Prime" w:hAnsi="Courier Prime"/>
-                <w:color w:val="1B1C1E"/>
+                <w:rFonts w:ascii="Montserrat" w:cs="Montserrat" w:eastAsia="Montserrat" w:hAnsi="Montserrat"/>
+                <w:color w:val="000000"/>
                 <w:sz w:val="20"/>
                 <w:szCs w:val="20"/>
               </w:rPr>
@@ -782,8 +782,8 @@
             </w:pPr>
             <w:r>
               <w:rPr>
-                <w:rFonts w:ascii="Courier Prime" w:cs="Courier Prime" w:eastAsia="Courier Prime" w:hAnsi="Courier Prime"/>
-                <w:color w:val="1B1C1E"/>
+                <w:rFonts w:ascii="Montserrat" w:cs="Montserrat" w:eastAsia="Montserrat" w:hAnsi="Montserrat"/>
+                <w:color w:val="000000"/>
                 <w:sz w:val="20"/>
                 <w:szCs w:val="20"/>
               </w:rPr>
@@ -813,12 +813,12 @@
             </w:pPr>
             <w:r>
               <w:rPr>
-                <w:rFonts w:ascii="Source Serif 4" w:cs="Source Serif 4" w:eastAsia="Source Serif 4" w:hAnsi="Source Serif 4"/>
-                <w:color w:val="1B1C1E"/>
+                <w:rFonts w:ascii="Roboto Serif" w:cs="Roboto Serif" w:eastAsia="Roboto Serif" w:hAnsi="Roboto Serif"/>
+                <w:color w:val="000000"/>
                 <w:sz w:val="22"/>
                 <w:szCs w:val="22"/>
               </w:rPr>
-              <w:t xml:space="preserve">inactivate (merged)</w:t>
+              <w:t xml:space="preserve">Inactivate (merged)</w:t>
             </w:r>
           </w:p>
         </w:tc>
@@ -844,8 +844,8 @@
             </w:pPr>
             <w:r>
               <w:rPr>
-                <w:rFonts w:ascii="Courier Prime" w:cs="Courier Prime" w:eastAsia="Courier Prime" w:hAnsi="Courier Prime"/>
-                <w:color w:val="1B1C1E"/>
+                <w:rFonts w:ascii="Montserrat" w:cs="Montserrat" w:eastAsia="Montserrat" w:hAnsi="Montserrat"/>
+                <w:color w:val="000000"/>
                 <w:sz w:val="20"/>
                 <w:szCs w:val="20"/>
               </w:rPr>
@@ -881,11 +881,11 @@
             <w:tcW w:type="dxa" w:w="9360"/>
             <w:tcBorders>
               <w:top w:val="none" w:color="FFFFFF" w:sz="0"/>
-              <w:left w:val="single" w:color="6E1F2A" w:sz="24"/>
+              <w:left w:val="single" w:color="D50032" w:sz="24"/>
               <w:bottom w:val="none" w:color="FFFFFF" w:sz="0"/>
               <w:right w:val="none" w:color="FFFFFF" w:sz="0"/>
             </w:tcBorders>
-            <w:shd w:fill="F7ECED" w:color="auto" w:val="clear"/>
+            <w:shd w:fill="FCE6EA" w:color="auto" w:val="clear"/>
             <w:tcMar>
               <w:top w:type="dxa" w:w="140"/>
               <w:left w:type="dxa" w:w="180"/>
@@ -899,12 +899,12 @@
             </w:pPr>
             <w:r>
               <w:rPr>
-                <w:rFonts w:ascii="Courier Prime" w:cs="Courier Prime" w:eastAsia="Courier Prime" w:hAnsi="Courier Prime"/>
-                <w:color w:val="6E1F2A"/>
+                <w:rFonts w:ascii="Montserrat" w:cs="Montserrat" w:eastAsia="Montserrat" w:hAnsi="Montserrat"/>
+                <w:color w:val="D50032"/>
                 <w:sz w:val="17"/>
                 <w:szCs w:val="17"/>
               </w:rPr>
-              <w:t xml:space="preserve">reviewer note</w:t>
+              <w:t xml:space="preserve">Reviewer note</w:t>
             </w:r>
           </w:p>
           <w:p>
@@ -913,8 +913,8 @@
             </w:pPr>
             <w:r>
               <w:rPr>
-                <w:rFonts w:ascii="Source Serif 4" w:cs="Source Serif 4" w:eastAsia="Source Serif 4" w:hAnsi="Source Serif 4"/>
-                <w:color w:val="1B1C1E"/>
+                <w:rFonts w:ascii="Roboto Serif" w:cs="Roboto Serif" w:eastAsia="Roboto Serif" w:hAnsi="Roboto Serif"/>
+                <w:color w:val="000000"/>
                 <w:sz w:val="22"/>
                 <w:szCs w:val="22"/>
               </w:rPr>
@@ -981,7 +981,7 @@
   <w:p>
     <w:pPr>
       <w:pBdr>
-        <w:top w:val="single" w:color="E6E6E3" w:sz="4" w:space="8"/>
+        <w:top w:val="single" w:color="E4E4E6" w:sz="4" w:space="8"/>
       </w:pBdr>
       <w:tabs>
         <w:tab w:val="right" w:pos="9360"/>
@@ -989,29 +989,29 @@
     </w:pPr>
     <w:r>
       <w:rPr>
-        <w:rFonts w:ascii="Courier Prime" w:cs="Courier Prime" w:eastAsia="Courier Prime" w:hAnsi="Courier Prime"/>
-        <w:color w:val="5E6166"/>
+        <w:rFonts w:ascii="Montserrat" w:cs="Montserrat" w:eastAsia="Montserrat" w:hAnsi="Montserrat"/>
+        <w:color w:val="55575B"/>
         <w:sz w:val="18"/>
         <w:szCs w:val="18"/>
       </w:rPr>
-      <w:t xml:space="preserve">cm-2026-014 · class curriculum committee</w:t>
+      <w:t xml:space="preserve">CM-2026-014 · CLASS Curriculum Committee</w:t>
     </w:r>
     <w:r>
       <w:tab/>
     </w:r>
     <w:r>
       <w:rPr>
-        <w:rFonts w:ascii="Courier Prime" w:cs="Courier Prime" w:eastAsia="Courier Prime" w:hAnsi="Courier Prime"/>
-        <w:color w:val="5E6166"/>
+        <w:rFonts w:ascii="Montserrat" w:cs="Montserrat" w:eastAsia="Montserrat" w:hAnsi="Montserrat"/>
+        <w:color w:val="55575B"/>
         <w:sz w:val="18"/>
         <w:szCs w:val="18"/>
       </w:rPr>
-      <w:t xml:space="preserve">page </w:t>
+      <w:t xml:space="preserve">Page </w:t>
     </w:r>
     <w:r>
       <w:rPr>
-        <w:rFonts w:ascii="Courier Prime" w:cs="Courier Prime" w:eastAsia="Courier Prime" w:hAnsi="Courier Prime"/>
-        <w:color w:val="5E6166"/>
+        <w:rFonts w:ascii="Montserrat" w:cs="Montserrat" w:eastAsia="Montserrat" w:hAnsi="Montserrat"/>
+        <w:color w:val="55575B"/>
         <w:sz w:val="18"/>
         <w:szCs w:val="18"/>
       </w:rPr>
@@ -1022,8 +1022,8 @@
     </w:r>
     <w:r>
       <w:rPr>
-        <w:rFonts w:ascii="Courier Prime" w:cs="Courier Prime" w:eastAsia="Courier Prime" w:hAnsi="Courier Prime"/>
-        <w:color w:val="5E6166"/>
+        <w:rFonts w:ascii="Montserrat" w:cs="Montserrat" w:eastAsia="Montserrat" w:hAnsi="Montserrat"/>
+        <w:color w:val="55575B"/>
         <w:sz w:val="18"/>
         <w:szCs w:val="18"/>
       </w:rPr>
@@ -1031,8 +1031,8 @@
     </w:r>
     <w:r>
       <w:rPr>
-        <w:rFonts w:ascii="Courier Prime" w:cs="Courier Prime" w:eastAsia="Courier Prime" w:hAnsi="Courier Prime"/>
-        <w:color w:val="5E6166"/>
+        <w:rFonts w:ascii="Montserrat" w:cs="Montserrat" w:eastAsia="Montserrat" w:hAnsi="Montserrat"/>
+        <w:color w:val="55575B"/>
         <w:sz w:val="18"/>
         <w:szCs w:val="18"/>
       </w:rPr>
@@ -1182,8 +1182,8 @@
   <w:docDefaults>
     <w:rPrDefault>
       <w:rPr>
-        <w:rFonts w:ascii="Source Serif 4" w:cs="Source Serif 4" w:eastAsia="Source Serif 4" w:hAnsi="Source Serif 4"/>
-        <w:color w:val="1B1C1E"/>
+        <w:rFonts w:ascii="Roboto Serif" w:cs="Roboto Serif" w:eastAsia="Roboto Serif" w:hAnsi="Roboto Serif"/>
+        <w:color w:val="000000"/>
         <w:sz w:val="22"/>
         <w:szCs w:val="22"/>
       </w:rPr>
@@ -1196,6 +1196,10 @@
     <w:next w:val="Normal"/>
     <w:qFormat/>
     <w:rPr>
+      <w:rFonts w:ascii="Montserrat" w:cs="Montserrat" w:eastAsia="Montserrat" w:hAnsi="Montserrat"/>
+      <w:b/>
+      <w:bCs/>
+      <w:color w:val="000000"/>
       <w:sz w:val="56"/>
       <w:szCs w:val="56"/>
     </w:rPr>
@@ -1206,7 +1210,10 @@
     <w:next w:val="Normal"/>
     <w:qFormat/>
     <w:rPr>
-      <w:color w:val="2E74B5"/>
+      <w:rFonts w:ascii="Montserrat" w:cs="Montserrat" w:eastAsia="Montserrat" w:hAnsi="Montserrat"/>
+      <w:b/>
+      <w:bCs/>
+      <w:color w:val="000000"/>
       <w:sz w:val="32"/>
       <w:szCs w:val="32"/>
     </w:rPr>
@@ -1217,7 +1224,10 @@
     <w:next w:val="Normal"/>
     <w:qFormat/>
     <w:rPr>
-      <w:color w:val="2E74B5"/>
+      <w:rFonts w:ascii="Montserrat" w:cs="Montserrat" w:eastAsia="Montserrat" w:hAnsi="Montserrat"/>
+      <w:b/>
+      <w:bCs/>
+      <w:color w:val="000000"/>
       <w:sz w:val="26"/>
       <w:szCs w:val="26"/>
     </w:rPr>
@@ -1228,7 +1238,10 @@
     <w:next w:val="Normal"/>
     <w:qFormat/>
     <w:rPr>
-      <w:color w:val="1F4D78"/>
+      <w:rFonts w:ascii="Montserrat" w:cs="Montserrat" w:eastAsia="Montserrat" w:hAnsi="Montserrat"/>
+      <w:b/>
+      <w:bCs/>
+      <w:color w:val="000000"/>
       <w:sz w:val="24"/>
       <w:szCs w:val="24"/>
     </w:rPr>
@@ -1239,9 +1252,10 @@
     <w:next w:val="Normal"/>
     <w:qFormat/>
     <w:rPr>
-      <w:i/>
-      <w:iCs/>
-      <w:color w:val="2E74B5"/>
+      <w:rFonts w:ascii="Montserrat" w:cs="Montserrat" w:eastAsia="Montserrat" w:hAnsi="Montserrat"/>
+      <w:b/>
+      <w:bCs/>
+      <w:color w:val="000000"/>
     </w:rPr>
   </w:style>
   <w:style w:type="paragraph" w:styleId="Heading5">
@@ -1250,7 +1264,10 @@
     <w:next w:val="Normal"/>
     <w:qFormat/>
     <w:rPr>
-      <w:color w:val="2E74B5"/>
+      <w:rFonts w:ascii="Montserrat" w:cs="Montserrat" w:eastAsia="Montserrat" w:hAnsi="Montserrat"/>
+      <w:b/>
+      <w:bCs/>
+      <w:color w:val="000000"/>
     </w:rPr>
   </w:style>
   <w:style w:type="paragraph" w:styleId="Heading6">
@@ -1259,7 +1276,10 @@
     <w:next w:val="Normal"/>
     <w:qFormat/>
     <w:rPr>
-      <w:color w:val="1F4D78"/>
+      <w:rFonts w:ascii="Montserrat" w:cs="Montserrat" w:eastAsia="Montserrat" w:hAnsi="Montserrat"/>
+      <w:b/>
+      <w:bCs/>
+      <w:color w:val="000000"/>
     </w:rPr>
   </w:style>
   <w:style w:type="paragraph" w:styleId="Strong">
@@ -1283,7 +1303,7 @@
     <w:uiPriority w:val="99"/>
     <w:unhideWhenUsed/>
     <w:rPr>
-      <w:color w:val="0563C1"/>
+      <w:color w:val="D50032"/>
       <w:u w:val="single"/>
     </w:rPr>
   </w:style>

</xml_diff>